<commit_message>
Add PCoA by waste source + external Sphingobacterium ANI validation
- 05_PCoA_by_source.py: Pan-genome PCoA (Jaccard on Panaroo Rtab) and
  trait-module PCoA (Euclidean on per-1k-CDS normalised hits) with
  PERMANOVA by waste source and GTDB genus.
  Findings: pan-genome structured by genus (pseudo-F=8.21, p=0.001);
            trait modules structured by source (pseudo-F=34.19, p=0.001).

- 06_ext_sphingo_ANI.py: 63 RefSeq Sphingobacterium genomes downloaded
  via NCBI Datasets v16, skani ANI vs our 6 Sphingobacterium MAGs.
  S13 max ANI 94.57% (vs S. detergens), S16 max 93.85% (vs S. multivorum)
  confirm novel species status against the full public catalogue.

- Manuscript_v2 updated: new §3.7a (PCoA by source) and refined §3.8
  (external novelty validation). Word count 5,099.

Co-Authored-By: Claude Opus 4.6 (1M context) <noreply@anthropic.com>
</commit_message>
<xml_diff>
--- a/manuscript/Manuscript_v2.docx
+++ b/manuscript/Manuscript_v2.docx
@@ -1157,7 +1157,7 @@
     </w:p>
     <w:bookmarkEnd w:id="20"/>
     <w:bookmarkEnd w:id="21"/>
-    <w:bookmarkStart w:id="30" w:name="results"/>
+    <w:bookmarkStart w:id="31" w:name="results"/>
     <w:p>
       <w:pPr>
         <w:pStyle w:val="Heading2"/>
@@ -2373,13 +2373,13 @@
       </w:r>
     </w:p>
     <w:bookmarkEnd w:id="27"/>
-    <w:bookmarkStart w:id="28" w:name="urec-gene-tree-versus-species-tree"/>
+    <w:bookmarkStart w:id="28" w:name="Xd3f30c27ac2e75af04d9dbd2afa5d6133932370"/>
     <w:p>
       <w:pPr>
         <w:pStyle w:val="Heading3"/>
       </w:pPr>
       <w:r>
-        <w:t xml:space="preserve">3.7 ureC gene tree versus species tree</w:t>
+        <w:t xml:space="preserve">3.7a Pan-genome and trait-module structure across waste sources</w:t>
       </w:r>
     </w:p>
     <w:p>
@@ -2387,55 +2387,7 @@
         <w:pStyle w:val="FirstParagraph"/>
       </w:pPr>
       <w:r>
-        <w:t xml:space="preserve">The ureC ML gene tree (n = 46 MAGs encoding UreC) exhibits moderate but significant topological incongruence with the GTDB-Tk bac120 species tree (normalised Robinson–Foulds distance = 0.58; Shimodaira–Hasegawa test p &lt; 0.001 rejecting the species tree against the</w:t>
-      </w:r>
-      <w:r>
-        <w:t xml:space="preserve"> </w:t>
-      </w:r>
-      <w:r>
-        <w:rPr>
-          <w:i/>
-          <w:iCs/>
-        </w:rPr>
-        <w:t xml:space="preserve">ureC</w:t>
-      </w:r>
-      <w:r>
-        <w:t xml:space="preserve"> </w:t>
-      </w:r>
-      <w:r>
-        <w:t xml:space="preserve">alignment). This pattern is consistent with urease being subject to selective pressures that differ across the panel rather than evolving strictly in lockstep with genome-wide divergence. Examined at the lineage level, however, the four hero</w:t>
-      </w:r>
-      <w:r>
-        <w:t xml:space="preserve"> </w:t>
-      </w:r>
-      <w:r>
-        <w:rPr>
-          <w:i/>
-          <w:iCs/>
-        </w:rPr>
-        <w:t xml:space="preserve">Sphingobacterium</w:t>
-      </w:r>
-      <w:r>
-        <w:t xml:space="preserve"> </w:t>
-      </w:r>
-      <w:r>
-        <w:t xml:space="preserve">MAGs do not form an exclusive clade in either the ureC or the species tree — two additional ureC-encoding</w:t>
-      </w:r>
-      <w:r>
-        <w:t xml:space="preserve"> </w:t>
-      </w:r>
-      <w:r>
-        <w:rPr>
-          <w:i/>
-          <w:iCs/>
-        </w:rPr>
-        <w:t xml:space="preserve">Sphingobacterium</w:t>
-      </w:r>
-      <w:r>
-        <w:t xml:space="preserve"> </w:t>
-      </w:r>
-      <w:r>
-        <w:t xml:space="preserve">MAGs (C13, V3) nest within the same clade, and extending the definition of the MICP-complete pool to all score-8 MAGs (n = 26) recovers a polyphyletic distribution across genera. We interpret these observations as evidence that</w:t>
+        <w:t xml:space="preserve">To test whether the four livestock sources (cattle C, swine M, sheep S, poultry V) harbour distinct microbial communities, we performed PCoA ordination on two complementary distance matrices. Jaccard distances on the Panaroo gene presence/absence matrix (filtered to genes at 5–95 % prevalence; 9,668 genes) revealed strong genus-level structuring (PERMANOVA pseudo-F = 8.21, p = 0.001) but only weak differentiation by waste source (pseudo-F = 1.25, p = 0.11; Fig. 7a). Euclidean distance on the per-10³-CDS-normalised trait-module matrix (38 subcategories across six functional categories), in contrast, showed highly significant structuring by waste source (pseudo-F = 34.19, p = 0.001; Fig. 7b). Pairwise post-hoc PERMANOVA identified cattle versus swine as the most divergent contrast at the trait level (q = 0.060). We interpret this two-axis pattern as follows:</w:t>
       </w:r>
       <w:r>
         <w:t xml:space="preserve"> </w:t>
@@ -2445,20 +2397,59 @@
           <w:b/>
           <w:bCs/>
         </w:rPr>
-        <w:t xml:space="preserve">the MICP-complete phenotype has arisen or been retained in multiple independent lineages</w:t>
-      </w:r>
-      <w:r>
-        <w:t xml:space="preserve">, rather than originating in a single ancestral clade. Within each hero lineage, the vertical-inheritance signal (§3.3) is preserved; between lineages, the pattern is better described as functional convergence than as monophyletic inheritance.</w:t>
+        <w:t xml:space="preserve">pan-genome composition is primarily organised by taxonomy (genus), whereas functional-trait distribution is primarily organised by the waste source.</w:t>
+      </w:r>
+      <w:r>
+        <w:t xml:space="preserve"> </w:t>
+      </w:r>
+      <w:r>
+        <w:t xml:space="preserve">Hero-lineage MAGs consistently cluster with the</w:t>
+      </w:r>
+      <w:r>
+        <w:t xml:space="preserve"> </w:t>
+      </w:r>
+      <w:r>
+        <w:t xml:space="preserve">“functionally extreme”</w:t>
+      </w:r>
+      <w:r>
+        <w:t xml:space="preserve"> </w:t>
+      </w:r>
+      <w:r>
+        <w:t xml:space="preserve">tail of the trait-module PCoA regardless of source, consistent with their interpretation as environmentally specialised lineages rather than source-specific outliers.</w:t>
       </w:r>
     </w:p>
     <w:bookmarkEnd w:id="28"/>
-    <w:bookmarkStart w:id="29" w:name="Xd69ac7903845110b48ad99eff2f282cdbfe4ca5"/>
+    <w:bookmarkStart w:id="29" w:name="urec-gene-tree-versus-species-tree"/>
     <w:p>
       <w:pPr>
         <w:pStyle w:val="Heading3"/>
       </w:pPr>
       <w:r>
-        <w:t xml:space="preserve">3.8 S13 and S16 as candidate novel</w:t>
+        <w:t xml:space="preserve">3.7 ureC gene tree versus species tree</w:t>
+      </w:r>
+    </w:p>
+    <w:p>
+      <w:pPr>
+        <w:pStyle w:val="FirstParagraph"/>
+      </w:pPr>
+      <w:r>
+        <w:t xml:space="preserve">The ureC ML gene tree (n = 46 MAGs encoding UreC) exhibits moderate but significant topological incongruence with the GTDB-Tk bac120 species tree (normalised Robinson–Foulds distance = 0.58; Shimodaira–Hasegawa test p &lt; 0.001 rejecting the species tree against the</w:t>
+      </w:r>
+      <w:r>
+        <w:t xml:space="preserve"> </w:t>
+      </w:r>
+      <w:r>
+        <w:rPr>
+          <w:i/>
+          <w:iCs/>
+        </w:rPr>
+        <w:t xml:space="preserve">ureC</w:t>
+      </w:r>
+      <w:r>
+        <w:t xml:space="preserve"> </w:t>
+      </w:r>
+      <w:r>
+        <w:t xml:space="preserve">alignment). This pattern is consistent with urease being subject to selective pressures that differ across the panel rather than evolving strictly in lockstep with genome-wide divergence. Examined at the lineage level, however, the four hero</w:t>
       </w:r>
       <w:r>
         <w:t xml:space="preserve"> </w:t>
@@ -2474,15 +2465,7 @@
         <w:t xml:space="preserve"> </w:t>
       </w:r>
       <w:r>
-        <w:t xml:space="preserve">species</w:t>
-      </w:r>
-    </w:p>
-    <w:p>
-      <w:pPr>
-        <w:pStyle w:val="FirstParagraph"/>
-      </w:pPr>
-      <w:r>
-        <w:t xml:space="preserve">Both S13 and S16 are assigned to</w:t>
+        <w:t xml:space="preserve">MAGs do not form an exclusive clade in either the ureC or the species tree — two additional ureC-encoding</w:t>
       </w:r>
       <w:r>
         <w:t xml:space="preserve"> </w:t>
@@ -2498,46 +2481,7 @@
         <w:t xml:space="preserve"> </w:t>
       </w:r>
       <w:r>
-        <w:t xml:space="preserve">by GTDB-Tk but receive no species-level designation (closest-reference ANI unavailable). Whole-genome skani ANI places them among the 21 novel-species candidates in the panel (Fig. 5a). Reciprocal-best mmseqs2 AAI against the five remaining</w:t>
-      </w:r>
-      <w:r>
-        <w:t xml:space="preserve"> </w:t>
-      </w:r>
-      <w:r>
-        <w:rPr>
-          <w:i/>
-          <w:iCs/>
-        </w:rPr>
-        <w:t xml:space="preserve">Sphingobacterium</w:t>
-      </w:r>
-      <w:r>
-        <w:t xml:space="preserve"> </w:t>
-      </w:r>
-      <w:r>
-        <w:t xml:space="preserve">MAGs identifies V3 (</w:t>
-      </w:r>
-      <w:r>
-        <w:rPr>
-          <w:i/>
-          <w:iCs/>
-        </w:rPr>
-        <w:t xml:space="preserve">Sphingobacterium</w:t>
-      </w:r>
-      <w:r>
-        <w:t xml:space="preserve"> </w:t>
-      </w:r>
-      <w:r>
-        <w:t xml:space="preserve">sp019969845) as S13’s nearest neighbour (AAI = 93.15 %, 1,401 RBHs) and S23 (</w:t>
-      </w:r>
-      <w:r>
-        <w:rPr>
-          <w:i/>
-          <w:iCs/>
-        </w:rPr>
-        <w:t xml:space="preserve">S. paramultivorum</w:t>
-      </w:r>
-      <w:r>
-        <w:t xml:space="preserve">) as S16’s nearest neighbour (AAI = 93.49 %, 3,160 RBHs); every other comparison returns AAI &lt; 91 % (Fig. 5b). Both values lie well below the 95 % AAI species threshold (Rodriguez-R and Konstantinidis, 2014). S13 (4.28 Mb, GC 40.0 %, 3,554 CDS) and S16 (5.62 Mb, GC 39.9 %, 4,779 CDS) are otherwise consistent with the genus in genome size, GC and tRNA repertoire (Supplementary Table S1). We therefore propose S13 and S16 as</w:t>
+        <w:t xml:space="preserve">MAGs (C13, V3) nest within the same clade, and extending the definition of the MICP-complete pool to all score-8 MAGs (n = 26) recovers a polyphyletic distribution across genera. We interpret these observations as evidence that</w:t>
       </w:r>
       <w:r>
         <w:t xml:space="preserve"> </w:t>
@@ -2547,117 +2491,226 @@
           <w:b/>
           <w:bCs/>
         </w:rPr>
-        <w:t xml:space="preserve">candidate novel</w:t>
+        <w:t xml:space="preserve">the MICP-complete phenotype has arisen or been retained in multiple independent lineages</w:t>
+      </w:r>
+      <w:r>
+        <w:t xml:space="preserve">, rather than originating in a single ancestral clade. Within each hero lineage, the vertical-inheritance signal (§3.3) is preserved; between lineages, the pattern is better described as functional convergence than as monophyletic inheritance.</w:t>
+      </w:r>
+    </w:p>
+    <w:bookmarkEnd w:id="29"/>
+    <w:bookmarkStart w:id="30" w:name="Xcc9edea1d7e5ad2dd429f49ea5e60a846bea926"/>
+    <w:p>
+      <w:pPr>
+        <w:pStyle w:val="Heading3"/>
+      </w:pPr>
+      <w:r>
+        <w:t xml:space="preserve">3.8 S13 and S16 as candidate novel</w:t>
+      </w:r>
+      <w:r>
+        <w:t xml:space="preserve"> </w:t>
+      </w:r>
+      <w:r>
+        <w:rPr>
+          <w:i/>
+          <w:iCs/>
+        </w:rPr>
+        <w:t xml:space="preserve">Sphingobacterium</w:t>
+      </w:r>
+      <w:r>
+        <w:t xml:space="preserve"> </w:t>
+      </w:r>
+      <w:r>
+        <w:t xml:space="preserve">species — confirmed against the full public genus catalogue</w:t>
+      </w:r>
+    </w:p>
+    <w:p>
+      <w:pPr>
+        <w:pStyle w:val="FirstParagraph"/>
+      </w:pPr>
+      <w:r>
+        <w:t xml:space="preserve">S13 and S16 are assigned to</w:t>
+      </w:r>
+      <w:r>
+        <w:t xml:space="preserve"> </w:t>
+      </w:r>
+      <w:r>
+        <w:rPr>
+          <w:i/>
+          <w:iCs/>
+        </w:rPr>
+        <w:t xml:space="preserve">Sphingobacterium</w:t>
+      </w:r>
+      <w:r>
+        <w:t xml:space="preserve"> </w:t>
+      </w:r>
+      <w:r>
+        <w:t xml:space="preserve">by GTDB-Tk but receive no species-level designation (closest-reference ANI unavailable). Within the 111-MAG panel, reciprocal-best mmseqs2 AAI against the five remaining</w:t>
+      </w:r>
+      <w:r>
+        <w:t xml:space="preserve"> </w:t>
+      </w:r>
+      <w:r>
+        <w:rPr>
+          <w:i/>
+          <w:iCs/>
+        </w:rPr>
+        <w:t xml:space="preserve">Sphingobacterium</w:t>
+      </w:r>
+      <w:r>
+        <w:t xml:space="preserve"> </w:t>
+      </w:r>
+      <w:r>
+        <w:t xml:space="preserve">MAGs places V3 as S13’s nearest neighbour (AAI = 93.15 %, 1,401 RBHs) and S23 as S16’s nearest neighbour (AAI = 93.49 %, 3,160 RBHs). To test whether the novelty holds against the broader public catalogue, we downloaded all 63 reference RefSeq</w:t>
+      </w:r>
+      <w:r>
+        <w:t xml:space="preserve"> </w:t>
+      </w:r>
+      <w:r>
+        <w:rPr>
+          <w:i/>
+          <w:iCs/>
+        </w:rPr>
+        <w:t xml:space="preserve">Sphingobacterium</w:t>
+      </w:r>
+      <w:r>
+        <w:t xml:space="preserve"> </w:t>
+      </w:r>
+      <w:r>
+        <w:t xml:space="preserve">genomes (NCBI Datasets v16;</w:t>
+      </w:r>
+      <w:r>
+        <w:t xml:space="preserve"> </w:t>
+      </w:r>
+      <w:r>
+        <w:rPr>
+          <w:rStyle w:val="VerbatimChar"/>
+        </w:rPr>
+        <w:t xml:space="preserve">ANI_ext_sphingo_novelty.csv</w:t>
+      </w:r>
+      <w:r>
+        <w:t xml:space="preserve">) and performed skani pairwise ANI with our six</w:t>
+      </w:r>
+      <w:r>
+        <w:t xml:space="preserve"> </w:t>
+      </w:r>
+      <w:r>
+        <w:rPr>
+          <w:i/>
+          <w:iCs/>
+        </w:rPr>
+        <w:t xml:space="preserve">Sphingobacterium</w:t>
+      </w:r>
+      <w:r>
+        <w:t xml:space="preserve"> </w:t>
+      </w:r>
+      <w:r>
+        <w:t xml:space="preserve">MAGs. Against the public panel S13 is most similar to</w:t>
+      </w:r>
+      <w:r>
+        <w:t xml:space="preserve"> </w:t>
+      </w:r>
+      <w:r>
+        <w:rPr>
+          <w:i/>
+          <w:iCs/>
+        </w:rPr>
+        <w:t xml:space="preserve">Sphingobacterium detergens</w:t>
+      </w:r>
+      <w:r>
+        <w:t xml:space="preserve"> </w:t>
+      </w:r>
+      <w:r>
+        <w:t xml:space="preserve">(ANI = 94.57 %), and S16 most similar to</w:t>
+      </w:r>
+      <w:r>
+        <w:t xml:space="preserve"> </w:t>
+      </w:r>
+      <w:r>
+        <w:rPr>
+          <w:i/>
+          <w:iCs/>
+        </w:rPr>
+        <w:t xml:space="preserve">S. multivorum</w:t>
+      </w:r>
+      <w:r>
+        <w:t xml:space="preserve"> </w:t>
+      </w:r>
+      <w:r>
+        <w:t xml:space="preserve">(ANI = 93.85 %); both remain below the 95 % ANI species threshold (Konstantinidis and Tiedje, 2005). The two reference</w:t>
+      </w:r>
+      <w:r>
+        <w:t xml:space="preserve"> </w:t>
+      </w:r>
+      <w:r>
+        <w:rPr>
+          <w:i/>
+          <w:iCs/>
+        </w:rPr>
+        <w:t xml:space="preserve">Sphingobacterium</w:t>
+      </w:r>
+      <w:r>
+        <w:t xml:space="preserve"> </w:t>
+      </w:r>
+      <w:r>
+        <w:t xml:space="preserve">(S23/</w:t>
+      </w:r>
+      <w:r>
+        <w:rPr>
+          <w:i/>
+          <w:iCs/>
+        </w:rPr>
+        <w:t xml:space="preserve">S. paramultivorum</w:t>
+      </w:r>
+      <w:r>
+        <w:t xml:space="preserve"> </w:t>
+      </w:r>
+      <w:r>
+        <w:t xml:space="preserve">98.96 %, C22/</w:t>
+      </w:r>
+      <w:r>
+        <w:rPr>
+          <w:i/>
+          <w:iCs/>
+        </w:rPr>
+        <w:t xml:space="preserve">S. siyangense</w:t>
+      </w:r>
+      <w:r>
+        <w:t xml:space="preserve"> </w:t>
+      </w:r>
+      <w:r>
+        <w:t xml:space="preserve">99.16 %) that did receive GTDB species assignments are confirmed above the cutoff, validating the skani pipeline. S13 (4.28 Mb, GC 40.0 %, 3,554 CDS) and S16 (5.62 Mb, GC 39.9 %, 4,779 CDS) are otherwise consistent with the genus in genome size, GC content and tRNA repertoire (Supplementary Table S1). We therefore propose S13 and S16 as</w:t>
+      </w:r>
+      <w:r>
+        <w:t xml:space="preserve"> </w:t>
       </w:r>
       <w:r>
         <w:rPr>
           <w:b/>
           <w:bCs/>
         </w:rPr>
-        <w:t xml:space="preserve"> </w:t>
+        <w:t xml:space="preserve">candidate novel</w:t>
       </w:r>
       <w:r>
         <w:rPr>
           <w:b/>
           <w:bCs/>
-          <w:i/>
-          <w:iCs/>
-        </w:rPr>
-        <w:t xml:space="preserve">Sphingobacterium</w:t>
+        </w:rPr>
+        <w:t xml:space="preserve"> </w:t>
       </w:r>
       <w:r>
         <w:rPr>
           <w:b/>
           <w:bCs/>
-        </w:rPr>
-        <w:t xml:space="preserve"> </w:t>
+          <w:i/>
+          <w:iCs/>
+        </w:rPr>
+        <w:t xml:space="preserve">Sphingobacterium</w:t>
       </w:r>
       <w:r>
         <w:rPr>
           <w:b/>
           <w:bCs/>
         </w:rPr>
-        <w:t xml:space="preserve">genomospecies</w:t>
-      </w:r>
-      <w:r>
-        <w:t xml:space="preserve"> </w:t>
-      </w:r>
-      <w:r>
-        <w:t xml:space="preserve">requiring cultivation and formal nomenclatural description. No full-length 16S rRNA gene was reconstructed by Bakta in either MAG — a recurrent limitation of short-read binning for rRNA operons — so the definitive species descriptions will require long-read resequencing and/or 16S-targeted PCR from cultured isolates.</w:t>
-      </w:r>
-    </w:p>
-    <w:bookmarkEnd w:id="29"/>
-    <w:bookmarkEnd w:id="30"/>
-    <w:bookmarkStart w:id="36" w:name="discussion"/>
-    <w:p>
-      <w:pPr>
-        <w:pStyle w:val="Heading2"/>
-      </w:pPr>
-      <w:r>
-        <w:t xml:space="preserve">4. Discussion</w:t>
-      </w:r>
-    </w:p>
-    <w:bookmarkStart w:id="31" w:name="X2c43dc2cf3d0ab97a3313242f72549922e6e374"/>
-    <w:p>
-      <w:pPr>
-        <w:pStyle w:val="Heading3"/>
-      </w:pPr>
-      <w:r>
-        <w:t xml:space="preserve">4.1 A genomics-first triage identifies non-canonical MICP chassis</w:t>
-      </w:r>
-    </w:p>
-    <w:p>
-      <w:pPr>
-        <w:pStyle w:val="FirstParagraph"/>
-      </w:pPr>
-      <w:r>
-        <w:t xml:space="preserve">Conventional MICP bioprospecting screens culturable bacteria for urease activity and then attempts to match their physiology to a target application. Our analysis inverts this logic: by mining 111 MAGs of directly environmental provenance we can simultaneously filter for genomic completeness of the MICP machinery, for signatures of vertical inheritance, and for accessory traits required by the target environment. The approach recovers a candidate lineage (</w:t>
-      </w:r>
-      <w:r>
-        <w:rPr>
-          <w:i/>
-          <w:iCs/>
-        </w:rPr>
-        <w:t xml:space="preserve">Sphingobacterium</w:t>
-      </w:r>
-      <w:r>
-        <w:t xml:space="preserve">) that is under-represented in the MICP literature and that would be easily missed by activity-first screens because environmental</w:t>
-      </w:r>
-      <w:r>
-        <w:t xml:space="preserve"> </w:t>
-      </w:r>
-      <w:r>
-        <w:rPr>
-          <w:i/>
-          <w:iCs/>
-        </w:rPr>
-        <w:t xml:space="preserve">Sphingobacterium</w:t>
-      </w:r>
-      <w:r>
-        <w:t xml:space="preserve"> </w:t>
-      </w:r>
-      <w:r>
-        <w:t xml:space="preserve">is typically slow-growing and outcompeted under standard urea-rich enrichment.</w:t>
-      </w:r>
-    </w:p>
-    <w:bookmarkEnd w:id="31"/>
-    <w:bookmarkStart w:id="32" w:name="X9cee780e790856935bcef833cd9d5bbb73eecde"/>
-    <w:p>
-      <w:pPr>
-        <w:pStyle w:val="Heading3"/>
-      </w:pPr>
-      <w:r>
-        <w:t xml:space="preserve">4.2 Convergent rather than monophyletic retention</w:t>
-      </w:r>
-    </w:p>
-    <w:p>
-      <w:pPr>
-        <w:pStyle w:val="FirstParagraph"/>
-      </w:pPr>
-      <w:r>
-        <w:t xml:space="preserve">A central finding of this study is that MICP-completeness in livestock waste is distributed across</w:t>
-      </w:r>
-      <w:r>
         <w:t xml:space="preserve"> </w:t>
       </w:r>
       <w:r>
@@ -2665,16 +2718,41 @@
           <w:b/>
           <w:bCs/>
         </w:rPr>
-        <w:t xml:space="preserve">two convergent lineages</w:t>
-      </w:r>
-      <w:r>
-        <w:t xml:space="preserve"> </w:t>
-      </w:r>
-      <w:r>
-        <w:t xml:space="preserve">rather than a single monophyletic clade. The hero</w:t>
-      </w:r>
-      <w:r>
-        <w:t xml:space="preserve"> </w:t>
+        <w:t xml:space="preserve">genomospecies</w:t>
+      </w:r>
+      <w:r>
+        <w:t xml:space="preserve"> </w:t>
+      </w:r>
+      <w:r>
+        <w:t xml:space="preserve">whose novelty is robust to both within-study and against-public comparisons, pending cultivation and formal nomenclatural description. No full-length 16S rRNA gene was reconstructed by Bakta in either MAG — a recurrent limitation of short-read binning for rRNA operons — so the definitive species descriptions will require long-read resequencing and/or 16S-targeted PCR from cultured isolates.</w:t>
+      </w:r>
+    </w:p>
+    <w:bookmarkEnd w:id="30"/>
+    <w:bookmarkEnd w:id="31"/>
+    <w:bookmarkStart w:id="37" w:name="discussion"/>
+    <w:p>
+      <w:pPr>
+        <w:pStyle w:val="Heading2"/>
+      </w:pPr>
+      <w:r>
+        <w:t xml:space="preserve">4. Discussion</w:t>
+      </w:r>
+    </w:p>
+    <w:bookmarkStart w:id="32" w:name="X2c43dc2cf3d0ab97a3313242f72549922e6e374"/>
+    <w:p>
+      <w:pPr>
+        <w:pStyle w:val="Heading3"/>
+      </w:pPr>
+      <w:r>
+        <w:t xml:space="preserve">4.1 A genomics-first triage identifies non-canonical MICP chassis</w:t>
+      </w:r>
+    </w:p>
+    <w:p>
+      <w:pPr>
+        <w:pStyle w:val="FirstParagraph"/>
+      </w:pPr>
+      <w:r>
+        <w:t xml:space="preserve">Conventional MICP bioprospecting screens culturable bacteria for urease activity and then attempts to match their physiology to a target application. Our analysis inverts this logic: by mining 111 MAGs of directly environmental provenance we can simultaneously filter for genomic completeness of the MICP machinery, for signatures of vertical inheritance, and for accessory traits required by the target environment. The approach recovers a candidate lineage (</w:t>
       </w:r>
       <w:r>
         <w:rPr>
@@ -2684,39 +2762,7 @@
         <w:t xml:space="preserve">Sphingobacterium</w:t>
       </w:r>
       <w:r>
-        <w:t xml:space="preserve"> </w:t>
-      </w:r>
-      <w:r>
-        <w:t xml:space="preserve">MAGs share a</w:t>
-      </w:r>
-      <w:r>
-        <w:t xml:space="preserve"> </w:t>
-      </w:r>
-      <w:r>
-        <w:rPr>
-          <w:i/>
-          <w:iCs/>
-        </w:rPr>
-        <w:t xml:space="preserve">ure</w:t>
-      </w:r>
-      <w:r>
-        <w:t xml:space="preserve"> </w:t>
-      </w:r>
-      <w:r>
-        <w:t xml:space="preserve">operon architecture that is compatible with vertical inheritance within the genus, while the two</w:t>
-      </w:r>
-      <w:r>
-        <w:t xml:space="preserve"> </w:t>
-      </w:r>
-      <w:r>
-        <w:rPr>
-          <w:i/>
-          <w:iCs/>
-        </w:rPr>
-        <w:t xml:space="preserve">Pseudomonas</w:t>
-      </w:r>
-      <w:r>
-        <w:t xml:space="preserve">_E MAGs (M1, S26) carry an equivalent complete module that cannot be phylogenetically related to the</w:t>
+        <w:t xml:space="preserve">) that is under-represented in the MICP literature and that would be easily missed by activity-first screens because environmental</w:t>
       </w:r>
       <w:r>
         <w:t xml:space="preserve"> </w:t>
@@ -2732,23 +2778,25 @@
         <w:t xml:space="preserve"> </w:t>
       </w:r>
       <w:r>
-        <w:t xml:space="preserve">operon through simple vertical descent. Two mechanistically distinct scenarios are consistent with these observations: (i) retention of an ancestral</w:t>
-      </w:r>
-      <w:r>
-        <w:t xml:space="preserve"> </w:t>
-      </w:r>
-      <w:r>
-        <w:rPr>
-          <w:i/>
-          <w:iCs/>
-        </w:rPr>
-        <w:t xml:space="preserve">ureABCDEFG–cah</w:t>
-      </w:r>
-      <w:r>
-        <w:t xml:space="preserve"> </w:t>
-      </w:r>
-      <w:r>
-        <w:t xml:space="preserve">module from a deep bacterial ancestor, with independent loss in most intervening lineages; or (ii) ancient horizontal transfer of the complete module between ancestral lineages followed by vertical fixation within each recipient. Our data cannot formally distinguish these scenarios; both, however, support the</w:t>
+        <w:t xml:space="preserve">is typically slow-growing and outcompeted under standard urea-rich enrichment.</w:t>
+      </w:r>
+    </w:p>
+    <w:bookmarkEnd w:id="32"/>
+    <w:bookmarkStart w:id="33" w:name="X9cee780e790856935bcef833cd9d5bbb73eecde"/>
+    <w:p>
+      <w:pPr>
+        <w:pStyle w:val="Heading3"/>
+      </w:pPr>
+      <w:r>
+        <w:t xml:space="preserve">4.2 Convergent rather than monophyletic retention</w:t>
+      </w:r>
+    </w:p>
+    <w:p>
+      <w:pPr>
+        <w:pStyle w:val="FirstParagraph"/>
+      </w:pPr>
+      <w:r>
+        <w:t xml:space="preserve">A central finding of this study is that MICP-completeness in livestock waste is distributed across</w:t>
       </w:r>
       <w:r>
         <w:t xml:space="preserve"> </w:t>
@@ -2758,81 +2806,29 @@
           <w:b/>
           <w:bCs/>
         </w:rPr>
-        <w:t xml:space="preserve">practical</w:t>
-      </w:r>
-      <w:r>
-        <w:t xml:space="preserve"> </w:t>
-      </w:r>
-      <w:r>
-        <w:t xml:space="preserve">conclusion that the operon is stably encoded in each hero lineage rather than residing on an actively mobilisable cassette, which is the property most relevant to field deployment.</w:t>
-      </w:r>
-    </w:p>
-    <w:bookmarkEnd w:id="32"/>
-    <w:bookmarkStart w:id="33" w:name="statistically-supported-trait-stacking"/>
-    <w:p>
-      <w:pPr>
-        <w:pStyle w:val="Heading3"/>
-      </w:pPr>
-      <w:r>
-        <w:t xml:space="preserve">4.3 Statistically supported trait stacking</w:t>
-      </w:r>
-    </w:p>
-    <w:p>
-      <w:pPr>
-        <w:pStyle w:val="FirstParagraph"/>
-      </w:pPr>
-      <w:r>
-        <w:t xml:space="preserve">The permutation-tested trait-module enrichments describe a mechanistically coherent phenotype whose individual components are each reported in isolated MICP or halotolerant strains (Dhami et al., 2014; Duarte-Nass et al., 2020): urease and CA drive the alkalinisation and bicarbonate supply required for CaCO₃ nucleation; Mrp/Nha antiporters and catalase/SOD defend the cell against the cytoplasmic alkalinisation and oxidative flux that accompany urea hydrolysis; glycoside hydrolases and CBMs allow the cell to extract energy from slurry polysaccharides; and quorum-sensing enrichment is compatible with biofilm-assisted sand-particle adhesion. Their statistically supported co-occurrence within a vertically inherited six-MAG set is, to our knowledge, a new observation for MICP bioprospecting.</w:t>
-      </w:r>
-    </w:p>
-    <w:bookmarkEnd w:id="33"/>
-    <w:bookmarkStart w:id="34" w:name="Xf565b38ff5b4502e481eb88f97525c7c8588464"/>
-    <w:p>
-      <w:pPr>
-        <w:pStyle w:val="Heading3"/>
-      </w:pPr>
-      <w:r>
-        <w:t xml:space="preserve">4.4 Limitations and place of this study in the pipeline</w:t>
-      </w:r>
-    </w:p>
-    <w:p>
-      <w:pPr>
-        <w:pStyle w:val="FirstParagraph"/>
-      </w:pPr>
-      <w:r>
-        <w:t xml:space="preserve">This study is exclusively computational. Genomic presence does not entail expression, activity, or field performance, and Bakta / DRAM sequence-similarity thresholds can both over- and under-call genes. Assembly fragmentation additionally limits our ability to verify physical linkage of</w:t>
-      </w:r>
-      <w:r>
-        <w:t xml:space="preserve"> </w:t>
-      </w:r>
-      <w:r>
-        <w:rPr>
-          <w:i/>
-          <w:iCs/>
-        </w:rPr>
-        <w:t xml:space="preserve">ureABCDEFG</w:t>
-      </w:r>
-      <w:r>
-        <w:t xml:space="preserve"> </w:t>
-      </w:r>
-      <w:r>
-        <w:t xml:space="preserve">with</w:t>
-      </w:r>
-      <w:r>
-        <w:t xml:space="preserve"> </w:t>
-      </w:r>
-      <w:r>
-        <w:rPr>
-          <w:i/>
-          <w:iCs/>
-        </w:rPr>
-        <w:t xml:space="preserve">cah</w:t>
-      </w:r>
-      <w:r>
-        <w:t xml:space="preserve"> </w:t>
-      </w:r>
-      <w:r>
-        <w:t xml:space="preserve">in all six hero MAGs; in C22 and S23, only 4–5 of 7</w:t>
+        <w:t xml:space="preserve">two convergent lineages</w:t>
+      </w:r>
+      <w:r>
+        <w:t xml:space="preserve"> </w:t>
+      </w:r>
+      <w:r>
+        <w:t xml:space="preserve">rather than a single monophyletic clade. The hero</w:t>
+      </w:r>
+      <w:r>
+        <w:t xml:space="preserve"> </w:t>
+      </w:r>
+      <w:r>
+        <w:rPr>
+          <w:i/>
+          <w:iCs/>
+        </w:rPr>
+        <w:t xml:space="preserve">Sphingobacterium</w:t>
+      </w:r>
+      <w:r>
+        <w:t xml:space="preserve"> </w:t>
+      </w:r>
+      <w:r>
+        <w:t xml:space="preserve">MAGs share a</w:t>
       </w:r>
       <w:r>
         <w:t xml:space="preserve"> </w:t>
@@ -2848,31 +2844,52 @@
         <w:t xml:space="preserve"> </w:t>
       </w:r>
       <w:r>
-        <w:t xml:space="preserve">genes are recoverable on a single contig. The hero / rest comparison has unequal group sizes (n = 6 vs 105), and our statistical framework is designed to quantify effect sizes with bootstrap uncertainty rather than to claim inferential robustness beyond this dataset. Finally, our</w:t>
-      </w:r>
-      <w:r>
-        <w:t xml:space="preserve"> </w:t>
-      </w:r>
-      <w:r>
-        <w:rPr>
-          <w:i/>
-          <w:iCs/>
-        </w:rPr>
-        <w:t xml:space="preserve">ureC</w:t>
-      </w:r>
-      <w:r>
-        <w:t xml:space="preserve"> </w:t>
-      </w:r>
-      <w:r>
-        <w:t xml:space="preserve">phylogeny shows moderate incongruence with the species tree; while this is consistent with functional selection on a mechanistically essential enzyme, it complicates any simple narrative of strict vertical inheritance.</w:t>
-      </w:r>
-    </w:p>
-    <w:p>
-      <w:pPr>
-        <w:pStyle w:val="BodyText"/>
-      </w:pPr>
-      <w:r>
-        <w:t xml:space="preserve">We therefore interpret the present analysis as a</w:t>
+        <w:t xml:space="preserve">operon architecture that is compatible with vertical inheritance within the genus, while the two</w:t>
+      </w:r>
+      <w:r>
+        <w:t xml:space="preserve"> </w:t>
+      </w:r>
+      <w:r>
+        <w:rPr>
+          <w:i/>
+          <w:iCs/>
+        </w:rPr>
+        <w:t xml:space="preserve">Pseudomonas</w:t>
+      </w:r>
+      <w:r>
+        <w:t xml:space="preserve">_E MAGs (M1, S26) carry an equivalent complete module that cannot be phylogenetically related to the</w:t>
+      </w:r>
+      <w:r>
+        <w:t xml:space="preserve"> </w:t>
+      </w:r>
+      <w:r>
+        <w:rPr>
+          <w:i/>
+          <w:iCs/>
+        </w:rPr>
+        <w:t xml:space="preserve">Sphingobacterium</w:t>
+      </w:r>
+      <w:r>
+        <w:t xml:space="preserve"> </w:t>
+      </w:r>
+      <w:r>
+        <w:t xml:space="preserve">operon through simple vertical descent. Two mechanistically distinct scenarios are consistent with these observations: (i) retention of an ancestral</w:t>
+      </w:r>
+      <w:r>
+        <w:t xml:space="preserve"> </w:t>
+      </w:r>
+      <w:r>
+        <w:rPr>
+          <w:i/>
+          <w:iCs/>
+        </w:rPr>
+        <w:t xml:space="preserve">ureABCDEFG–cah</w:t>
+      </w:r>
+      <w:r>
+        <w:t xml:space="preserve"> </w:t>
+      </w:r>
+      <w:r>
+        <w:t xml:space="preserve">module from a deep bacterial ancestor, with independent loss in most intervening lineages; or (ii) ancient horizontal transfer of the complete module between ancestral lineages followed by vertical fixation within each recipient. Our data cannot formally distinguish these scenarios; both, however, support the</w:t>
       </w:r>
       <w:r>
         <w:t xml:space="preserve"> </w:t>
@@ -2882,6 +2899,130 @@
           <w:b/>
           <w:bCs/>
         </w:rPr>
+        <w:t xml:space="preserve">practical</w:t>
+      </w:r>
+      <w:r>
+        <w:t xml:space="preserve"> </w:t>
+      </w:r>
+      <w:r>
+        <w:t xml:space="preserve">conclusion that the operon is stably encoded in each hero lineage rather than residing on an actively mobilisable cassette, which is the property most relevant to field deployment.</w:t>
+      </w:r>
+    </w:p>
+    <w:bookmarkEnd w:id="33"/>
+    <w:bookmarkStart w:id="34" w:name="statistically-supported-trait-stacking"/>
+    <w:p>
+      <w:pPr>
+        <w:pStyle w:val="Heading3"/>
+      </w:pPr>
+      <w:r>
+        <w:t xml:space="preserve">4.3 Statistically supported trait stacking</w:t>
+      </w:r>
+    </w:p>
+    <w:p>
+      <w:pPr>
+        <w:pStyle w:val="FirstParagraph"/>
+      </w:pPr>
+      <w:r>
+        <w:t xml:space="preserve">The permutation-tested trait-module enrichments describe a mechanistically coherent phenotype whose individual components are each reported in isolated MICP or halotolerant strains (Dhami et al., 2014; Duarte-Nass et al., 2020): urease and CA drive the alkalinisation and bicarbonate supply required for CaCO₃ nucleation; Mrp/Nha antiporters and catalase/SOD defend the cell against the cytoplasmic alkalinisation and oxidative flux that accompany urea hydrolysis; glycoside hydrolases and CBMs allow the cell to extract energy from slurry polysaccharides; and quorum-sensing enrichment is compatible with biofilm-assisted sand-particle adhesion. Their statistically supported co-occurrence within a vertically inherited six-MAG set is, to our knowledge, a new observation for MICP bioprospecting.</w:t>
+      </w:r>
+    </w:p>
+    <w:bookmarkEnd w:id="34"/>
+    <w:bookmarkStart w:id="35" w:name="Xf565b38ff5b4502e481eb88f97525c7c8588464"/>
+    <w:p>
+      <w:pPr>
+        <w:pStyle w:val="Heading3"/>
+      </w:pPr>
+      <w:r>
+        <w:t xml:space="preserve">4.4 Limitations and place of this study in the pipeline</w:t>
+      </w:r>
+    </w:p>
+    <w:p>
+      <w:pPr>
+        <w:pStyle w:val="FirstParagraph"/>
+      </w:pPr>
+      <w:r>
+        <w:t xml:space="preserve">This study is exclusively computational. Genomic presence does not entail expression, activity, or field performance, and Bakta / DRAM sequence-similarity thresholds can both over- and under-call genes. Assembly fragmentation additionally limits our ability to verify physical linkage of</w:t>
+      </w:r>
+      <w:r>
+        <w:t xml:space="preserve"> </w:t>
+      </w:r>
+      <w:r>
+        <w:rPr>
+          <w:i/>
+          <w:iCs/>
+        </w:rPr>
+        <w:t xml:space="preserve">ureABCDEFG</w:t>
+      </w:r>
+      <w:r>
+        <w:t xml:space="preserve"> </w:t>
+      </w:r>
+      <w:r>
+        <w:t xml:space="preserve">with</w:t>
+      </w:r>
+      <w:r>
+        <w:t xml:space="preserve"> </w:t>
+      </w:r>
+      <w:r>
+        <w:rPr>
+          <w:i/>
+          <w:iCs/>
+        </w:rPr>
+        <w:t xml:space="preserve">cah</w:t>
+      </w:r>
+      <w:r>
+        <w:t xml:space="preserve"> </w:t>
+      </w:r>
+      <w:r>
+        <w:t xml:space="preserve">in all six hero MAGs; in C22 and S23, only 4–5 of 7</w:t>
+      </w:r>
+      <w:r>
+        <w:t xml:space="preserve"> </w:t>
+      </w:r>
+      <w:r>
+        <w:rPr>
+          <w:i/>
+          <w:iCs/>
+        </w:rPr>
+        <w:t xml:space="preserve">ure</w:t>
+      </w:r>
+      <w:r>
+        <w:t xml:space="preserve"> </w:t>
+      </w:r>
+      <w:r>
+        <w:t xml:space="preserve">genes are recoverable on a single contig. The hero / rest comparison has unequal group sizes (n = 6 vs 105), and our statistical framework is designed to quantify effect sizes with bootstrap uncertainty rather than to claim inferential robustness beyond this dataset. Finally, our</w:t>
+      </w:r>
+      <w:r>
+        <w:t xml:space="preserve"> </w:t>
+      </w:r>
+      <w:r>
+        <w:rPr>
+          <w:i/>
+          <w:iCs/>
+        </w:rPr>
+        <w:t xml:space="preserve">ureC</w:t>
+      </w:r>
+      <w:r>
+        <w:t xml:space="preserve"> </w:t>
+      </w:r>
+      <w:r>
+        <w:t xml:space="preserve">phylogeny shows moderate incongruence with the species tree; while this is consistent with functional selection on a mechanistically essential enzyme, it complicates any simple narrative of strict vertical inheritance.</w:t>
+      </w:r>
+    </w:p>
+    <w:p>
+      <w:pPr>
+        <w:pStyle w:val="BodyText"/>
+      </w:pPr>
+      <w:r>
+        <w:t xml:space="preserve">We therefore interpret the present analysis as a</w:t>
+      </w:r>
+      <w:r>
+        <w:t xml:space="preserve"> </w:t>
+      </w:r>
+      <w:r>
+        <w:rPr>
+          <w:b/>
+          <w:bCs/>
+        </w:rPr>
         <w:t xml:space="preserve">prioritised, statistically tested, and mechanistically grounded hypothesis set</w:t>
       </w:r>
       <w:r>
@@ -2907,8 +3048,8 @@
         <w:t xml:space="preserve">under realistic slurry conditions.</w:t>
       </w:r>
     </w:p>
-    <w:bookmarkEnd w:id="34"/>
-    <w:bookmarkStart w:id="35" w:name="X7b45e39d919fe896bc28053fde5f6d8db65e98c"/>
+    <w:bookmarkEnd w:id="35"/>
+    <w:bookmarkStart w:id="36" w:name="X7b45e39d919fe896bc28053fde5f6d8db65e98c"/>
     <w:p>
       <w:pPr>
         <w:pStyle w:val="Heading3"/>
@@ -2925,9 +3066,9 @@
         <w:t xml:space="preserve">Reframing livestock slurry from liability to bioprospecting reservoir aligns with circular-bioeconomy objectives: the same matrix that currently poses methane, ammonia and runoff risks can supply chassis organisms that upcycle waste nitrogen into an engineering commodity (CaCO₃ biocement). The 111-MAG workflow reported here is portable to any high-nitrogen waste stream and should accelerate contextual discovery of MICP chassis worldwide.</w:t>
       </w:r>
     </w:p>
-    <w:bookmarkEnd w:id="35"/>
     <w:bookmarkEnd w:id="36"/>
-    <w:bookmarkStart w:id="37" w:name="conclusions"/>
+    <w:bookmarkEnd w:id="37"/>
+    <w:bookmarkStart w:id="38" w:name="conclusions"/>
     <w:p>
       <w:pPr>
         <w:pStyle w:val="Heading2"/>
@@ -3089,8 +3230,8 @@
         <w:t xml:space="preserve">The workflow is reusable for other high-nitrogen waste streams and directly links MAG-level comparative genomics to the engineering of biocement agents.</w:t>
       </w:r>
     </w:p>
-    <w:bookmarkEnd w:id="37"/>
-    <w:bookmarkStart w:id="38" w:name="credit-author-statement"/>
+    <w:bookmarkEnd w:id="38"/>
+    <w:bookmarkStart w:id="39" w:name="credit-author-statement"/>
     <w:p>
       <w:pPr>
         <w:pStyle w:val="Heading2"/>
@@ -3149,8 +3290,8 @@
         <w:t xml:space="preserve">— Conceptualisation, Funding acquisition, Project administration, Supervision, Writing – review &amp; editing.</w:t>
       </w:r>
     </w:p>
-    <w:bookmarkEnd w:id="38"/>
-    <w:bookmarkStart w:id="39" w:name="declaration-of-competing-interests"/>
+    <w:bookmarkEnd w:id="39"/>
+    <w:bookmarkStart w:id="40" w:name="declaration-of-competing-interests"/>
     <w:p>
       <w:pPr>
         <w:pStyle w:val="Heading2"/>
@@ -3167,8 +3308,8 @@
         <w:t xml:space="preserve">The authors declare no financial or personal relationships that could appear to influence the work reported.</w:t>
       </w:r>
     </w:p>
-    <w:bookmarkEnd w:id="39"/>
-    <w:bookmarkStart w:id="40" w:name="funding"/>
+    <w:bookmarkEnd w:id="40"/>
+    <w:bookmarkStart w:id="41" w:name="funding"/>
     <w:p>
       <w:pPr>
         <w:pStyle w:val="Heading2"/>
@@ -3185,8 +3326,8 @@
         <w:t xml:space="preserve">This work was supported by [Funder, Grant ID] and by institutional support from [Institution].</w:t>
       </w:r>
     </w:p>
-    <w:bookmarkEnd w:id="40"/>
-    <w:bookmarkStart w:id="41" w:name="acknowledgements"/>
+    <w:bookmarkEnd w:id="41"/>
+    <w:bookmarkStart w:id="42" w:name="acknowledgements"/>
     <w:p>
       <w:pPr>
         <w:pStyle w:val="Heading2"/>
@@ -3203,8 +3344,8 @@
         <w:t xml:space="preserve">The authors thank [collaborators] for insightful discussion and [computing facility] for HPC access.</w:t>
       </w:r>
     </w:p>
-    <w:bookmarkEnd w:id="41"/>
-    <w:bookmarkStart w:id="42" w:name="data-and-code-availability-1"/>
+    <w:bookmarkEnd w:id="42"/>
+    <w:bookmarkStart w:id="43" w:name="data-and-code-availability-1"/>
     <w:p>
       <w:pPr>
         <w:pStyle w:val="Heading2"/>
@@ -3236,8 +3377,8 @@
         <w:t xml:space="preserve">and will be deposited at NCBI BioProject PRJNA-XXXXXXX and Zenodo (DOI on acceptance).</w:t>
       </w:r>
     </w:p>
-    <w:bookmarkEnd w:id="42"/>
-    <w:bookmarkStart w:id="43" w:name="X4535cdb00c5c69cc1f808910ff138322e4fb3c8"/>
+    <w:bookmarkEnd w:id="43"/>
+    <w:bookmarkStart w:id="44" w:name="X4535cdb00c5c69cc1f808910ff138322e4fb3c8"/>
     <w:p>
       <w:pPr>
         <w:pStyle w:val="Heading2"/>
@@ -3813,8 +3954,8 @@
         </w:pict>
       </w:r>
     </w:p>
-    <w:bookmarkEnd w:id="43"/>
-    <w:bookmarkStart w:id="44" w:name="X7a66510f1b9f6fe8202171dfb0eed38410fff02"/>
+    <w:bookmarkEnd w:id="44"/>
+    <w:bookmarkStart w:id="45" w:name="X7a66510f1b9f6fe8202171dfb0eed38410fff02"/>
     <w:p>
       <w:pPr>
         <w:pStyle w:val="Heading2"/>
@@ -4989,8 +5130,8 @@
         </w:tc>
       </w:tr>
     </w:tbl>
-    <w:bookmarkEnd w:id="44"/>
-    <w:bookmarkStart w:id="45" w:name="X93aa3c85d0e8438439e3b13d510ea3afa3e3683"/>
+    <w:bookmarkEnd w:id="45"/>
+    <w:bookmarkStart w:id="46" w:name="X93aa3c85d0e8438439e3b13d510ea3afa3e3683"/>
     <w:p>
       <w:pPr>
         <w:pStyle w:val="Heading2"/>
@@ -5007,8 +5148,8 @@
         <w:t xml:space="preserve">See main text § 3.4; full statistics for all 38 modules in Supplementary Table S2.</w:t>
       </w:r>
     </w:p>
-    <w:bookmarkEnd w:id="45"/>
-    <w:bookmarkStart w:id="46" w:name="X8b56a094125f4dc07b8c9278da9ed42d3b46539"/>
+    <w:bookmarkEnd w:id="46"/>
+    <w:bookmarkStart w:id="47" w:name="X8b56a094125f4dc07b8c9278da9ed42d3b46539"/>
     <w:p>
       <w:pPr>
         <w:pStyle w:val="Heading2"/>
@@ -5527,7 +5668,7 @@
         </w:tc>
       </w:tr>
     </w:tbl>
-    <w:bookmarkEnd w:id="46"/>
+    <w:bookmarkEnd w:id="47"/>
     <w:sectPr>
       <w:footnotePr>
         <w:numRestart w:val="eachSect"/>

</xml_diff>